<commit_message>
atualizado codigo para ficar mais confortável
</commit_message>
<xml_diff>
--- a/documentos/historia.docx
+++ b/documentos/historia.docx
@@ -1,6 +1,6 @@
 
 <file path=word/document.xml><?xml version="1.0" encoding="utf-8"?>
-<w:document xmlns:wpc="http://schemas.microsoft.com/office/word/2010/wordprocessingCanvas" xmlns:cx="http://schemas.microsoft.com/office/drawing/2014/chartex" xmlns:cx1="http://schemas.microsoft.com/office/drawing/2015/9/8/chartex" xmlns:cx2="http://schemas.microsoft.com/office/drawing/2015/10/21/chartex" xmlns:cx3="http://schemas.microsoft.com/office/drawing/2016/5/9/chartex" xmlns:cx4="http://schemas.microsoft.com/office/drawing/2016/5/10/chartex" xmlns:cx5="http://schemas.microsoft.com/office/drawing/2016/5/11/chartex" xmlns:cx6="http://schemas.microsoft.com/office/drawing/2016/5/12/chartex" xmlns:cx7="http://schemas.microsoft.com/office/drawing/2016/5/13/chartex" xmlns:cx8="http://schemas.microsoft.com/office/drawing/2016/5/14/chartex" xmlns:mc="http://schemas.openxmlformats.org/markup-compatibility/2006" xmlns:aink="http://schemas.microsoft.com/office/drawing/2016/ink" xmlns:am3d="http://schemas.microsoft.com/office/drawing/2017/model3d" xmlns:o="urn:schemas-microsoft-com:office:office" xmlns:oel="http://schemas.microsoft.com/office/2019/extlst" xmlns:r="http://schemas.openxmlformats.org/officeDocument/2006/relationships" xmlns:m="http://schemas.openxmlformats.org/officeDocument/2006/math" xmlns:v="urn:schemas-microsoft-com:vml" xmlns:wp14="http://schemas.microsoft.com/office/word/2010/wordprocessingDrawing" xmlns:wp="http://schemas.openxmlformats.org/drawingml/2006/wordprocessingDrawing" xmlns:w10="urn:schemas-microsoft-com:office:word" xmlns:w="http://schemas.openxmlformats.org/wordprocessingml/2006/main" xmlns:w14="http://schemas.microsoft.com/office/word/2010/wordml" xmlns:w15="http://schemas.microsoft.com/office/word/2012/wordml" xmlns:w16cex="http://schemas.microsoft.com/office/word/2018/wordml/cex" xmlns:w16cid="http://schemas.microsoft.com/office/word/2016/wordml/cid" xmlns:w16="http://schemas.microsoft.com/office/word/2018/wordml" xmlns:w16du="http://schemas.microsoft.com/office/word/2023/wordml/word16du" xmlns:w16sdtdh="http://schemas.microsoft.com/office/word/2020/wordml/sdtdatahash" xmlns:w16sdtfl="http://schemas.microsoft.com/office/word/2024/wordml/sdtformatlock" xmlns:w16se="http://schemas.microsoft.com/office/word/2015/wordml/symex" xmlns:wpg="http://schemas.microsoft.com/office/word/2010/wordprocessingGroup" xmlns:wpi="http://schemas.microsoft.com/office/word/2010/wordprocessingInk" xmlns:wne="http://schemas.microsoft.com/office/word/2006/wordml" xmlns:wps="http://schemas.microsoft.com/office/word/2010/wordprocessingShape" mc:Ignorable="w14 w15 w16se w16cid w16 w16cex w16sdtdh w16sdtfl w16du wp14">
+<w:document xmlns:wpc="http://schemas.microsoft.com/office/word/2010/wordprocessingCanvas" xmlns:cx="http://schemas.microsoft.com/office/drawing/2014/chartex" xmlns:cx1="http://schemas.microsoft.com/office/drawing/2015/9/8/chartex" xmlns:cx2="http://schemas.microsoft.com/office/drawing/2015/10/21/chartex" xmlns:cx3="http://schemas.microsoft.com/office/drawing/2016/5/9/chartex" xmlns:cx4="http://schemas.microsoft.com/office/drawing/2016/5/10/chartex" xmlns:cx5="http://schemas.microsoft.com/office/drawing/2016/5/11/chartex" xmlns:cx6="http://schemas.microsoft.com/office/drawing/2016/5/12/chartex" xmlns:cx7="http://schemas.microsoft.com/office/drawing/2016/5/13/chartex" xmlns:cx8="http://schemas.microsoft.com/office/drawing/2016/5/14/chartex" xmlns:mc="http://schemas.openxmlformats.org/markup-compatibility/2006" xmlns:aink="http://schemas.microsoft.com/office/drawing/2016/ink" xmlns:am3d="http://schemas.microsoft.com/office/drawing/2017/model3d" xmlns:o="urn:schemas-microsoft-com:office:office" xmlns:oel="http://schemas.microsoft.com/office/2019/extlst" xmlns:r="http://schemas.openxmlformats.org/officeDocument/2006/relationships" xmlns:m="http://schemas.openxmlformats.org/officeDocument/2006/math" xmlns:v="urn:schemas-microsoft-com:vml" xmlns:wp14="http://schemas.microsoft.com/office/word/2010/wordprocessingDrawing" xmlns:wp="http://schemas.openxmlformats.org/drawingml/2006/wordprocessingDrawing" xmlns:w10="urn:schemas-microsoft-com:office:word" xmlns:w="http://schemas.openxmlformats.org/wordprocessingml/2006/main" xmlns:w14="http://schemas.microsoft.com/office/word/2010/wordml" xmlns:w15="http://schemas.microsoft.com/office/word/2012/wordml" xmlns:w16cei="http://schemas.microsoft.com/office/word/2026/wordml/cei" xmlns:w16cex="http://schemas.microsoft.com/office/word/2018/wordml/cex" xmlns:w16cid="http://schemas.microsoft.com/office/word/2016/wordml/cid" xmlns:w16="http://schemas.microsoft.com/office/word/2018/wordml" xmlns:w16du="http://schemas.microsoft.com/office/word/2023/wordml/word16du" xmlns:w16sdtdh="http://schemas.microsoft.com/office/word/2020/wordml/sdtdatahash" xmlns:w16sdtfl="http://schemas.microsoft.com/office/word/2024/wordml/sdtformatlock" xmlns:w16se="http://schemas.microsoft.com/office/word/2015/wordml/symex" xmlns:wpg="http://schemas.microsoft.com/office/word/2010/wordprocessingGroup" xmlns:wpi="http://schemas.microsoft.com/office/word/2010/wordprocessingInk" xmlns:wne="http://schemas.microsoft.com/office/word/2006/wordml" xmlns:wps="http://schemas.microsoft.com/office/word/2010/wordprocessingShape" mc:Ignorable="w14 w15 w16se w16cid w16 w16cex w16sdtdh w16sdtfl w16du wp14">
   <w:body>
     <w:p>
       <w:pPr>
@@ -58,7 +58,34 @@
     </w:p>
     <w:p>
       <w:r>
-        <w:t xml:space="preserve">A aventura começa numa taverna, os jogadores se apresentam. Eles estão lá em busca de missões. Durante a viagem para Portões de </w:t>
+        <w:t>A aventura começa</w:t>
+      </w:r>
+      <w:r>
+        <w:t>, como toda boa aventura de RPG,</w:t>
+      </w:r>
+      <w:r>
+        <w:t xml:space="preserve"> numa taverna, </w:t>
+      </w:r>
+      <w:proofErr w:type="gramStart"/>
+      <w:r>
+        <w:t>você são</w:t>
+      </w:r>
+      <w:proofErr w:type="gramEnd"/>
+      <w:r>
+        <w:t xml:space="preserve"> aventureiros. Ganham a vida fazendo todo tipo de missões, fazendo trabalhos para diversos tipos de pessoas. Em algum momento vocês se conheceram, talvez em uma missão ou talvez em algum outro momento, mas acabaram formando uma equipe pois perceberam que apesar de menos ouro o serviço se tornava mais seguro. A Taverna onde vocês estão é uma das mais conhecidas deste lado da cidade Portões de </w:t>
+      </w:r>
+      <w:proofErr w:type="spellStart"/>
+      <w:r>
+        <w:t>Baldur</w:t>
+      </w:r>
+      <w:proofErr w:type="spellEnd"/>
+      <w:r>
+        <w:t>. O nome é Mestre Piedoso e além de taverna ela também serve como uma estalagem. Não é um lugar muito grande, mas é muito bem movimentado e por isso estão lá. Bebendo, e comendo o dinheiro da última missão.  “Me digam, por favor o que que os personagens estão fazendo”</w:t>
+      </w:r>
+    </w:p>
+    <w:p>
+      <w:r>
+        <w:t xml:space="preserve">. Eles estão lá em busca de missões. Durante a viagem para Portões de </w:t>
       </w:r>
       <w:proofErr w:type="spellStart"/>
       <w:r>
@@ -248,6 +275,7 @@
     <w:p/>
     <w:p>
       <w:r>
+        <w:lastRenderedPageBreak/>
         <w:t xml:space="preserve">Opções de viagem: </w:t>
       </w:r>
     </w:p>
@@ -956,6 +984,7 @@
   <w:style w:type="character" w:default="1" w:styleId="Fontepargpadro">
     <w:name w:val="Default Paragraph Font"/>
     <w:uiPriority w:val="1"/>
+    <w:semiHidden/>
     <w:unhideWhenUsed/>
   </w:style>
   <w:style w:type="table" w:default="1" w:styleId="Tabelanormal">

</xml_diff>